<commit_message>
Add scaffolded Turn & Talk discussion-point sections to all lessons
</commit_message>
<xml_diff>
--- a/lessons/1-1/downloads/1-1-notes.docx
+++ b/lessons/1-1/downloads/1-1-notes.docx
@@ -349,6 +349,232 @@
           <w:szCs w:val="19"/>
         </w:rPr>
         <w:t xml:space="preserve">2³ means 2 × 2 × 2 = 8</w:t>
+      </w:r>
+    </w:p>
+    <w:p>
+      <w:pPr>
+        <w:pStyle w:val="Heading2"/>
+        <w:pBdr>
+          <w:left w:val="single" w:color="1FA6A2" w:sz="18" w:space="8"/>
+        </w:pBdr>
+        <w:spacing w:after="100" w:before="200"/>
+      </w:pPr>
+      <w:r>
+        <w:rPr>
+          <w:b/>
+          <w:bCs/>
+          <w:color w:val="1FA6A2"/>
+          <w:sz w:val="26"/>
+          <w:szCs w:val="26"/>
+        </w:rPr>
+        <w:t xml:space="preserve">Turn &amp; Talk — Discussion Points  (Level 1 support · Level 2)</w:t>
+      </w:r>
+    </w:p>
+    <w:p>
+      <w:pPr>
+        <w:spacing w:after="60"/>
+      </w:pPr>
+      <w:r>
+        <w:rPr>
+          <w:i/>
+          <w:iCs/>
+          <w:color w:val="5F6F80"/>
+          <w:sz w:val="19"/>
+          <w:szCs w:val="19"/>
+        </w:rPr>
+        <w:t xml:space="preserve">Talk with a partner. Use the Level 1 stems if you need help getting started; try the Level 2 question when you are ready for more.</w:t>
+      </w:r>
+    </w:p>
+    <w:p>
+      <w:pPr>
+        <w:spacing w:after="60"/>
+      </w:pPr>
+      <w:r>
+        <w:rPr>
+          <w:b/>
+          <w:bCs/>
+          <w:color w:val="12355B"/>
+          <w:sz w:val="21"/>
+          <w:szCs w:val="21"/>
+        </w:rPr>
+        <w:t xml:space="preserve">1. [Explore] </w:t>
+      </w:r>
+      <w:r>
+        <w:rPr>
+          <w:b/>
+          <w:bCs/>
+          <w:sz w:val="21"/>
+          <w:szCs w:val="21"/>
+        </w:rPr>
+        <w:t xml:space="preserve">Look at your factor tree. How did you decide which numbers to break apart first?</w:t>
+      </w:r>
+    </w:p>
+    <w:p>
+      <w:pPr>
+        <w:spacing w:after="60"/>
+      </w:pPr>
+      <w:r>
+        <w:rPr>
+          <w:sz w:val="21"/>
+          <w:szCs w:val="21"/>
+        </w:rPr>
+        <w:t xml:space="preserve">I broke ___ into ___ because ___.</w:t>
+      </w:r>
+      <w:r>
+        <w:rPr>
+          <w:i/>
+          <w:iCs/>
+          <w:color w:val="5F6F80"/>
+          <w:sz w:val="19"/>
+          <w:szCs w:val="19"/>
+        </w:rPr>
+        <w:br/>
+        <w:t xml:space="preserve">
+Separé ___ en ___ porque ___.</w:t>
+      </w:r>
+    </w:p>
+    <w:p>
+      <w:pPr>
+        <w:spacing w:after="60"/>
+      </w:pPr>
+      <w:r>
+        <w:rPr>
+          <w:sz w:val="21"/>
+          <w:szCs w:val="21"/>
+        </w:rPr>
+        <w:t xml:space="preserve">A prime number is ___.</w:t>
+      </w:r>
+      <w:r>
+        <w:rPr>
+          <w:i/>
+          <w:iCs/>
+          <w:color w:val="5F6F80"/>
+          <w:sz w:val="19"/>
+          <w:szCs w:val="19"/>
+        </w:rPr>
+        <w:br/>
+        <w:t xml:space="preserve">
+Un número primo es ___.</w:t>
+      </w:r>
+    </w:p>
+    <w:p>
+      <w:pPr>
+        <w:spacing w:after="60"/>
+      </w:pPr>
+      <w:r>
+        <w:rPr>
+          <w:sz w:val="21"/>
+          <w:szCs w:val="21"/>
+        </w:rPr>
+        <w:t xml:space="preserve">This helps in real life when ___.</w:t>
+      </w:r>
+      <w:r>
+        <w:rPr>
+          <w:i/>
+          <w:iCs/>
+          <w:color w:val="5F6F80"/>
+          <w:sz w:val="19"/>
+          <w:szCs w:val="19"/>
+        </w:rPr>
+        <w:br/>
+        <w:t xml:space="preserve">
+Esto ayuda en la vida real cuando ___.</w:t>
+      </w:r>
+    </w:p>
+    <w:p>
+      <w:pPr>
+        <w:spacing w:after="60"/>
+      </w:pPr>
+      <w:r>
+        <w:rPr>
+          <w:b/>
+          <w:bCs/>
+          <w:color w:val="12355B"/>
+          <w:sz w:val="21"/>
+          <w:szCs w:val="21"/>
+        </w:rPr>
+        <w:t xml:space="preserve">2. [Connect] </w:t>
+      </w:r>
+      <w:r>
+        <w:rPr>
+          <w:b/>
+          <w:bCs/>
+          <w:sz w:val="21"/>
+          <w:szCs w:val="21"/>
+        </w:rPr>
+        <w:t xml:space="preserve">How could prime factorization help someone arrange objects into equal groups?</w:t>
+      </w:r>
+    </w:p>
+    <w:p>
+      <w:pPr>
+        <w:spacing w:after="60"/>
+      </w:pPr>
+      <w:r>
+        <w:rPr>
+          <w:sz w:val="21"/>
+          <w:szCs w:val="21"/>
+        </w:rPr>
+        <w:t xml:space="preserve">I broke ___ into ___ because ___.</w:t>
+      </w:r>
+      <w:r>
+        <w:rPr>
+          <w:i/>
+          <w:iCs/>
+          <w:color w:val="5F6F80"/>
+          <w:sz w:val="19"/>
+          <w:szCs w:val="19"/>
+        </w:rPr>
+        <w:br/>
+        <w:t xml:space="preserve">
+Separé ___ en ___ porque ___.</w:t>
+      </w:r>
+    </w:p>
+    <w:p>
+      <w:pPr>
+        <w:spacing w:after="60"/>
+      </w:pPr>
+      <w:r>
+        <w:rPr>
+          <w:sz w:val="21"/>
+          <w:szCs w:val="21"/>
+        </w:rPr>
+        <w:t xml:space="preserve">A prime number is ___.</w:t>
+      </w:r>
+      <w:r>
+        <w:rPr>
+          <w:i/>
+          <w:iCs/>
+          <w:color w:val="5F6F80"/>
+          <w:sz w:val="19"/>
+          <w:szCs w:val="19"/>
+        </w:rPr>
+        <w:br/>
+        <w:t xml:space="preserve">
+Un número primo es ___.</w:t>
+      </w:r>
+    </w:p>
+    <w:p>
+      <w:pPr>
+        <w:spacing w:after="60"/>
+      </w:pPr>
+      <w:r>
+        <w:rPr>
+          <w:sz w:val="21"/>
+          <w:szCs w:val="21"/>
+        </w:rPr>
+        <w:t xml:space="preserve">This helps in real life when ___.</w:t>
+      </w:r>
+      <w:r>
+        <w:rPr>
+          <w:i/>
+          <w:iCs/>
+          <w:color w:val="5F6F80"/>
+          <w:sz w:val="19"/>
+          <w:szCs w:val="19"/>
+        </w:rPr>
+        <w:br/>
+        <w:t xml:space="preserve">
+Esto ayuda en la vida real cuando ___.</w:t>
       </w:r>
     </w:p>
     <w:p>

</xml_diff>